<commit_message>
Fix Table 10 (exp105): correct non-reproducible DA-baseline accuracies
The reported SEED->DREAMER/DEAP RF baseline of 61.38%/61.25% was not
reproducible. A faithful rerun using the canonical source-fit pipeline
(run_exp101_reproducible.py) yields zero-shot accuracy 34.84%/35.30%
(chance level; 3-class chance = 33.3%), with CORAL/AdaBN identical to RF
(preserving the 'no improvement from feature alignment' finding). Table 10
updated accordingly; run_exp105_da_baselines.py now uses source-fit scaling
for reproducibility. results/exp105_da_baselines/ stays gitignored
(regenerable from the script), consistent with the other result files.
</commit_message>
<xml_diff>
--- a/paper_en_submission_v5.docx
+++ b/paper_en_submission_v5.docx
@@ -15952,7 +15952,7 @@
         <w:textAlignment w:val="auto"/>
       </w:pPr>
       <w:r>
-        <w:t>Table 10. Domain generalization baseline comparison (SEED → target, single source).</w:t>
+        <w:t>Table 10. Domain generalization baseline comparison (SEED → target, single source; zero-shot accuracy, 20 seeds).</w:t>
       </w:r>
     </w:p>
     <w:tbl>
@@ -16033,27 +16033,8 @@
             <w:tcW w:w="1814" w:type="dxa"/>
           </w:tcPr>
           <w:p>
-            <w:pPr>
-              <w:pageBreakBefore w:val="0"/>
-              <w:widowControl/>
-              <w:kinsoku/>
-              <w:wordWrap/>
-              <w:overflowPunct/>
-              <w:topLinePunct w:val="0"/>
-              <w:autoSpaceDE/>
-              <w:autoSpaceDN/>
-              <w:bidi w:val="0"/>
-              <w:adjustRightInd/>
-              <w:snapToGrid/>
-              <w:spacing w:after="20" w:line="480" w:lineRule="auto"/>
-              <w:textAlignment w:val="auto"/>
-            </w:pPr>
-            <w:r>
-              <w:rPr>
-                <w:b/>
-                <w:sz w:val="17"/>
-              </w:rPr>
-              <w:t>SEED → DREAMER</w:t>
+            <w:r>
+              <w:t>SEED → DREAMER (ZS acc. %)</w:t>
             </w:r>
           </w:p>
         </w:tc>
@@ -16062,27 +16043,8 @@
             <w:tcW w:w="1701" w:type="dxa"/>
           </w:tcPr>
           <w:p>
-            <w:pPr>
-              <w:pageBreakBefore w:val="0"/>
-              <w:widowControl/>
-              <w:kinsoku/>
-              <w:wordWrap/>
-              <w:overflowPunct/>
-              <w:topLinePunct w:val="0"/>
-              <w:autoSpaceDE/>
-              <w:autoSpaceDN/>
-              <w:bidi w:val="0"/>
-              <w:adjustRightInd/>
-              <w:snapToGrid/>
-              <w:spacing w:after="20" w:line="480" w:lineRule="auto"/>
-              <w:textAlignment w:val="auto"/>
-            </w:pPr>
-            <w:r>
-              <w:rPr>
-                <w:b/>
-                <w:sz w:val="17"/>
-              </w:rPr>
-              <w:t>SEED → DEAP</w:t>
+            <w:r>
+              <w:t>SEED → DEAP (ZS acc. %)</w:t>
             </w:r>
           </w:p>
         </w:tc>
@@ -16166,26 +16128,8 @@
             <w:tcW w:w="1814" w:type="dxa"/>
           </w:tcPr>
           <w:p>
-            <w:pPr>
-              <w:pageBreakBefore w:val="0"/>
-              <w:widowControl/>
-              <w:kinsoku/>
-              <w:wordWrap/>
-              <w:overflowPunct/>
-              <w:topLinePunct w:val="0"/>
-              <w:autoSpaceDE/>
-              <w:autoSpaceDN/>
-              <w:bidi w:val="0"/>
-              <w:adjustRightInd/>
-              <w:snapToGrid/>
-              <w:spacing w:after="20" w:line="480" w:lineRule="auto"/>
-              <w:textAlignment w:val="auto"/>
-            </w:pPr>
-            <w:r>
-              <w:rPr>
-                <w:sz w:val="17"/>
-              </w:rPr>
-              <w:t>61.38%</w:t>
+            <w:r>
+              <w:t>34.84%</w:t>
             </w:r>
           </w:p>
         </w:tc>
@@ -16194,26 +16138,8 @@
             <w:tcW w:w="1701" w:type="dxa"/>
           </w:tcPr>
           <w:p>
-            <w:pPr>
-              <w:pageBreakBefore w:val="0"/>
-              <w:widowControl/>
-              <w:kinsoku/>
-              <w:wordWrap/>
-              <w:overflowPunct/>
-              <w:topLinePunct w:val="0"/>
-              <w:autoSpaceDE/>
-              <w:autoSpaceDN/>
-              <w:bidi w:val="0"/>
-              <w:adjustRightInd/>
-              <w:snapToGrid/>
-              <w:spacing w:after="20" w:line="480" w:lineRule="auto"/>
-              <w:textAlignment w:val="auto"/>
-            </w:pPr>
-            <w:r>
-              <w:rPr>
-                <w:sz w:val="17"/>
-              </w:rPr>
-              <w:t>61.25%</w:t>
+            <w:r>
+              <w:t>35.30%</w:t>
             </w:r>
           </w:p>
         </w:tc>
@@ -16296,26 +16222,8 @@
             <w:tcW w:w="1814" w:type="dxa"/>
           </w:tcPr>
           <w:p>
-            <w:pPr>
-              <w:pageBreakBefore w:val="0"/>
-              <w:widowControl/>
-              <w:kinsoku/>
-              <w:wordWrap/>
-              <w:overflowPunct/>
-              <w:topLinePunct w:val="0"/>
-              <w:autoSpaceDE/>
-              <w:autoSpaceDN/>
-              <w:bidi w:val="0"/>
-              <w:adjustRightInd/>
-              <w:snapToGrid/>
-              <w:spacing w:after="20" w:line="480" w:lineRule="auto"/>
-              <w:textAlignment w:val="auto"/>
-            </w:pPr>
-            <w:r>
-              <w:rPr>
-                <w:sz w:val="17"/>
-              </w:rPr>
-              <w:t>61.38%</w:t>
+            <w:r>
+              <w:t>34.84%</w:t>
             </w:r>
           </w:p>
         </w:tc>
@@ -16324,26 +16232,8 @@
             <w:tcW w:w="1701" w:type="dxa"/>
           </w:tcPr>
           <w:p>
-            <w:pPr>
-              <w:pageBreakBefore w:val="0"/>
-              <w:widowControl/>
-              <w:kinsoku/>
-              <w:wordWrap/>
-              <w:overflowPunct/>
-              <w:topLinePunct w:val="0"/>
-              <w:autoSpaceDE/>
-              <w:autoSpaceDN/>
-              <w:bidi w:val="0"/>
-              <w:adjustRightInd/>
-              <w:snapToGrid/>
-              <w:spacing w:after="20" w:line="480" w:lineRule="auto"/>
-              <w:textAlignment w:val="auto"/>
-            </w:pPr>
-            <w:r>
-              <w:rPr>
-                <w:sz w:val="17"/>
-              </w:rPr>
-              <w:t>61.25%</w:t>
+            <w:r>
+              <w:t>35.30%</w:t>
             </w:r>
           </w:p>
         </w:tc>
@@ -16426,26 +16316,8 @@
             <w:tcW w:w="1814" w:type="dxa"/>
           </w:tcPr>
           <w:p>
-            <w:pPr>
-              <w:pageBreakBefore w:val="0"/>
-              <w:widowControl/>
-              <w:kinsoku/>
-              <w:wordWrap/>
-              <w:overflowPunct/>
-              <w:topLinePunct w:val="0"/>
-              <w:autoSpaceDE/>
-              <w:autoSpaceDN/>
-              <w:bidi w:val="0"/>
-              <w:adjustRightInd/>
-              <w:snapToGrid/>
-              <w:spacing w:after="20" w:line="480" w:lineRule="auto"/>
-              <w:textAlignment w:val="auto"/>
-            </w:pPr>
-            <w:r>
-              <w:rPr>
-                <w:sz w:val="17"/>
-              </w:rPr>
-              <w:t>61.38%</w:t>
+            <w:r>
+              <w:t>34.84%</w:t>
             </w:r>
           </w:p>
         </w:tc>
@@ -16454,26 +16326,8 @@
             <w:tcW w:w="1701" w:type="dxa"/>
           </w:tcPr>
           <w:p>
-            <w:pPr>
-              <w:pageBreakBefore w:val="0"/>
-              <w:widowControl/>
-              <w:kinsoku/>
-              <w:wordWrap/>
-              <w:overflowPunct/>
-              <w:topLinePunct w:val="0"/>
-              <w:autoSpaceDE/>
-              <w:autoSpaceDN/>
-              <w:bidi w:val="0"/>
-              <w:adjustRightInd/>
-              <w:snapToGrid/>
-              <w:spacing w:after="20" w:line="480" w:lineRule="auto"/>
-              <w:textAlignment w:val="auto"/>
-            </w:pPr>
-            <w:r>
-              <w:rPr>
-                <w:sz w:val="17"/>
-              </w:rPr>
-              <w:t>61.25%</w:t>
+            <w:r>
+              <w:t>35.30%</w:t>
             </w:r>
           </w:p>
         </w:tc>

</xml_diff>

<commit_message>
docs: apply PONE 核查报告 B1/B16/B17 fixes (eval-subset class counts; Wilcoxon V/Z statistic; Overall SD note)
</commit_message>
<xml_diff>
--- a/paper_en_submission_v5.docx
+++ b/paper_en_submission_v5.docx
@@ -5517,7 +5517,7 @@
         <w:textAlignment w:val="auto"/>
       </w:pPr>
       <w:r>
-        <w:t>Table 3. Within-domain upper bound (same 63-dim features, RF 200 trees, participant-disjoint (session-disjoint for ds006437) GroupShuffleSplit 80/20, 20 seeds; values mean ± SD). Cross-domain zero-shot BAcc is reproduced from Table 4 for direct comparison. Delta = within BAcc minus cross-domain ZS BAcc. Only ds006437 (within BAcc 68.2%) exceeds the 40% learnable-signal threshold; DEAP (35.7%) and ds004572 (38.7%) are marginal; the remaining five datasets sit at or below three-class chance even within-dataset, indicating their proxy labels carry little learnable class signal.</w:t>
+        <w:t>Table 3. Within-domain upper bound (same 63-dim features, RF 200 trees, participant-disjoint (session-disjoint for ds006437) GroupShuffleSplit 80/20, 20 seeds; values mean ± SD). Cross-domain zero-shot BAcc is reproduced from Table 4 for direct comparison. Delta = within BAcc minus cross-domain ZS BAcc. Only ds006437 (within BAcc 68.2%) exceeds the 40% learnable-signal threshold; DEAP (35.7%) and ds004572 (38.7%) are marginal; the remaining five datasets sit at or below three-class chance even within-dataset, indicating their proxy labels carry little learnable class signal. Overall SD is the standard deviation computed across all 160 target-seed observations (n = 160), not pooled from the eight per-dataset SDs.</w:t>
       </w:r>
     </w:p>
     <w:p>
@@ -5598,10 +5598,7 @@
         <w:textAlignment w:val="auto"/>
       </w:pPr>
       <w:r>
-        <w:t>Table 4. Multi-source LODO results (20 seeds). Values are mean ± SD with the 95% confidence interval in parentheses.</w:t>
-      </w:r>
-      <w:r>
-        <w:t xml:space="preserve"> Δ is the calibrated minus zero-shot accuracy difference computed from unrounded per-seed means; minor discrepancies with the rounded accuracy columns are due to independent rounding. Raw p is the two-sided Wilcoxon signed-rank test over the 20 seed pairs; Holm p is the Holm–Bonferroni step-down adjusted value over the family of eight target-level tests (m = 8, α = 0.05), with the three undefined tests treated as non-significant.</w:t>
+        <w:t>Table 4. Multi-source LODO results (20 seeds). Values are mean ± SD with the 95% confidence interval in parentheses. Δ is the calibrated minus zero-shot accuracy difference computed from unrounded per-seed means; minor discrepancies with the rounded accuracy columns are due to independent rounding. Raw p is the two-sided Wilcoxon signed-rank test over the 20 seed pairs; Holm p is the Holm–Bonferroni step-down adjusted value over the family of eight target-level tests (m = 8, α = 0.05), with the three undefined tests treated as non-significant. Overall SD is the standard deviation computed across all 160 target-seed observations (n = 160), not pooled from the eight per-dataset SDs.</w:t>
       </w:r>
     </w:p>
     <w:tbl>
@@ -8797,7 +8794,7 @@
         <w:textAlignment w:val="auto"/>
       </w:pPr>
       <w:r>
-        <w:t>Overall zero-shot accuracy is 36.85%, 3.52pp above three-class chance, and calibration reaches 43.76%, a +6.91pp mean change. That aggregate figure, however, does not describe a general effect. A single paired Wilcoxon test over all 160 zero-shot/calibrated pairs yields p = 3.89 (this two-sided signed-rank test treats the 160 seed pairs as independent and ignores clustering by target domain)×10⁻⁵, but the median paired change is 0.00pp and seven of the eight targets show a median calibration gain of approximately zero or negative. The aggregate significance is produced entirely by ds006437, whose +54.30pp shift is analysed in Section 4.4. We therefore do not interpret the aggregate p-value as evidence of a generalizable calibration benefit.</w:t>
+        <w:t>Overall zero-shot accuracy is 36.85%, 3.52pp above three-class chance, and calibration reaches 43.76%, a +6.91pp mean change. That aggregate figure, however, does not describe a general effect. A single paired Wilcoxon signed-rank test over the 160 zero-shot/calibrated pairs (two-sided; the 60 pairs from FACED, SEED and SEED_IV with identically zero differences are dropped, leaving 100 ranked pairs) yields V = 1,329, Z ≈ −4.11, p = 3.89 (this two-sided signed-rank test treats the 160 seed pairs as independent and ignores clustering by target domain)×10⁻⁵, but the median paired change is 0.00pp and seven of the eight targets show a median calibration gain of approximately zero or negative. The aggregate significance is produced entirely by ds006437, whose +54.30pp shift is analysed in Section 4.4. We therefore do not interpret the aggregate p-value as evidence of a generalizable calibration benefit.</w:t>
       </w:r>
     </w:p>
     <w:p>
@@ -10450,7 +10447,7 @@
         <w:textAlignment w:val="auto"/>
       </w:pPr>
       <w:r>
-        <w:t>ds006437 produces both the lowest zero-shot accuracy and the largest calibration gain in the study, and the two facts have the same cause. Zero-shot, the source-trained model assigns essentially every ds006437 window to Deep (recall 100.0%, Table 5). Because Deep accounts for only 5,064 of the 60,384 ds006437 windows (8.4%), that prediction yields 6.31% accuracy, far below the 33.3% chance level. Adding 20% of target participants supplies the classifier with ds006437’s own dominant class, Light (44,423 windows, 73.6%), and accuracy rises to 60.60%. Balanced accuracy nonetheless remains 33.51% and κ is indistinguishable from zero, so the gain is a majority-class flip rather than an improvement in three-class discrimination.</w:t>
+        <w:t>ds006437 produces both the lowest zero-shot accuracy and the largest calibration gain in the study, and the two facts have the same cause. Zero-shot, the source-trained model assigns essentially every ds006437 window to Deep (recall 100.0%, Table 5). Because Deep accounts for only 5,064 of the 60,384 ds006437 windows (8.4%), that prediction yields 6.31% accuracy, far below the 33.3% chance level. The 6.31% figure is measured on the evaluation (test) subset, which by stratified split preserves this imbalance: across the 20 seeds the test subset contains Deep ≈6.0% / Light ≈57.0% / Awake ≈37.0% (e.g., 244 / 2,428 / 1,546 of 4,218 windows at seed 42; 7,562 / 71,710 / 46,602 across all 20 seeds), so the low accuracy reflects Deep’s rarity rather than a balanced prior. Adding 20% of target participants supplies the classifier with ds006437’s own dominant class, Light (44,423 windows, 73.6%), and accuracy rises to 60.60%. Balanced accuracy nonetheless remains 33.51% and κ is indistinguishable from zero, so the gain is a majority-class flip rather than an improvement in three-class discrimination.</w:t>
       </w:r>
     </w:p>
     <w:p>

</xml_diff>

<commit_message>
docs: apply PONE 核查报告 A3 (1 learnable/2 marginal/5 noise taxonomy) and A9 (concept-DOI + tag v1.0.5 reproducibility citations)
</commit_message>
<xml_diff>
--- a/paper_en_submission_v5.docx
+++ b/paper_en_submission_v5.docx
@@ -18134,7 +18134,7 @@
         <w:textAlignment w:val="auto"/>
       </w:pPr>
       <w:r>
-        <w:t>The central finding of this study is negative and, we argue, informative. The within-domain upper bound (Table 3) shows that five of eight proxy label sets yield balanced accuracy at or below three-class chance (33.3%) even in the easiest same-dataset setting (one is learnable within-dataset and two are marginal), so their labels carry essentially no learnable class signal. Only ds006437 (within BAcc 68.2%) has labels that are learnable within-dataset, yet its cross-dataset transfer still collapses to chance-level balanced accuracy (33.5%). Raw cross-dataset accuracy above chance was obtained on five of eight targets, yet balanced accuracy never exceeded 35.62% and Cohen's κ never exceeded 0.068, and every apparent success decomposes into majority-class prediction once per-class recall is examined.</w:t>
+        <w:t>The central finding of this study is negative and, we argue, informative. The within-domain upper bound (Table 3) shows that, of the eight proxy label sets, one is learnable within-dataset (ds006437, within BAcc 68.2%), two are marginal (DEAP 35.7%, ds004572 38.7%), and five yield balanced accuracy at or below chance even in the easiest same-dataset setting, so their labels carry essentially no learnable class signal. Only ds006437 (within BAcc 68.2%) has labels that are learnable within-dataset, yet its cross-dataset transfer still collapses to chance-level balanced accuracy (33.5%). Raw cross-dataset accuracy above chance was obtained on five of eight targets, yet balanced accuracy never exceeded 35.62% and Cohen's κ never exceeded 0.068, and every apparent success decomposes into majority-class prediction once per-class recall is examined.</w:t>
       </w:r>
     </w:p>
     <w:p>
@@ -20780,7 +20780,7 @@
         <w:textAlignment w:val="auto"/>
       </w:pPr>
       <w:r>
-        <w:t>The complete source code, experiment scripts, configuration files and result files are released under the MIT licence. Every result reported in this paper was produced by release v1.0.1, permanently archived at https://doi.org/10.5281/zenodo.21833478 (deposited 7 August 2026); the concept DOI https://doi.org/10.5281/zenodo.21531272 always resolves to the most recent version. The development repository, tagged v1.0.1, is https://github.com/korose523/Hypnotise. All paths in the released code are relative to the repository root, the analysis environment is pinned by requirements.txt, and the experiment parameters quoted throughout this paper are held in config.yaml.</w:t>
+        <w:t>The complete source code, experiment scripts, configuration files and result files are released under the MIT licence. Every result reported in this paper was produced by the code archived under the concept DOI https://doi.org/10.5281/zenodo.21531272 (which always resolves to the most recent version) and released at https://github.com/korose523/Hypnotise (tag v1.0.5). All paths in the released code are relative to the repository root, the analysis environment is pinned by requirements.txt, and the experiment parameters quoted throughout this paper are held in config.yaml.</w:t>
       </w:r>
     </w:p>
     <w:p>
@@ -20811,10 +20811,7 @@
     <w:p>
       <w:pPr/>
       <w:r>
-        <w:rPr>
-          <w:i/>
-        </w:rPr>
-        <w:t>Table 14. Reproducibility map: the script and result file that regenerate every table reported in this manuscript. Scripts are released under the MIT licence at https://github.com/korose523/Hypnotise (tag v1.0.1); result files are archived at https://doi.org/10.5281/zenodo.21833478.</w:t>
+        <w:t>Table 14. Reproducibility map: the script and result file that regenerate every table reported in this manuscript. Scripts are released under the MIT licence at https://github.com/korose523/Hypnotise (tag v1.0.5); result files are archived at https://doi.org/10.5281/zenodo.21531272 (concept DOI, resolves to the latest version).</w:t>
       </w:r>
     </w:p>
     <w:tbl>
@@ -21460,7 +21457,7 @@
         <w:textAlignment w:val="auto"/>
       </w:pPr>
       <w:r>
-        <w:t>The v1.0.1 archive (https://doi.org/10.5281/zenodo.21833478) contains the analysis code, configuration files and the complete result files from which every table in this paper is generated, so all reported numbers can be re-derived without recomputation. The intermediate feature and label matrices are not redistributed: they run to tens of gigabytes and are derivative works of datasets released under their own licences. They are regenerated deterministically from the raw sources by the preprocessing scripts listed above, and the participant-level split assignments follow from the participant identifiers described in Section 3.2 together with the seeds listed in Appendix A.</w:t>
+        <w:t>The archive under concept DOI https://doi.org/10.5281/zenodo.21531272 contains the analysis code, configuration files and the complete result files from which every table in this paper is generated, so all reported numbers can be re-derived without recomputation. The intermediate feature and label matrices are not redistributed: they run to tens of gigabytes and are derivative works of datasets released under their own licences. They are regenerated deterministically from the raw sources by the preprocessing scripts listed above, and the participant-level split assignments follow from the participant identifiers described in Section 3.2 together with the seeds listed in Appendix A.</w:t>
       </w:r>
     </w:p>
     <w:p>

</xml_diff>

<commit_message>
fix(B16): correct corrupted Wilcoxon p-value in Sec 4.3 (p=3.92e-5, recomputed from data) and bump reproducibility tag to v1.0.6
</commit_message>
<xml_diff>
--- a/paper_en_submission_v5.docx
+++ b/paper_en_submission_v5.docx
@@ -8794,7 +8794,7 @@
         <w:textAlignment w:val="auto"/>
       </w:pPr>
       <w:r>
-        <w:t>Overall zero-shot accuracy is 36.85%, 3.52pp above three-class chance, and calibration reaches 43.76%, a +6.91pp mean change. That aggregate figure, however, does not describe a general effect. A single paired Wilcoxon signed-rank test over the 160 zero-shot/calibrated pairs (two-sided; the 60 pairs from FACED, SEED and SEED_IV with identically zero differences are dropped, leaving 100 ranked pairs) yields V = 1,329, Z ≈ −4.11, p = 3.89 (this two-sided signed-rank test treats the 160 seed pairs as independent and ignores clustering by target domain)×10⁻⁵, but the median paired change is 0.00pp and seven of the eight targets show a median calibration gain of approximately zero or negative. The aggregate significance is produced entirely by ds006437, whose +54.30pp shift is analysed in Section 4.4. We therefore do not interpret the aggregate p-value as evidence of a generalizable calibration benefit.</w:t>
+        <w:t>Overall zero-shot accuracy is 36.85%, 3.52pp above three-class chance, and calibration reaches 43.76%, a +6.91pp mean change. That aggregate figure, however, does not describe a general effect. A single paired Wilcoxon signed-rank test over the 160 zero-shot/calibrated pairs (two-sided; the 60 pairs from FACED, SEED and SEED_IV with identically zero differences are dropped, leaving 100 ranked pairs) yields V = 1,329, Z ≈ −4.11, p = 3.92×10⁻⁵ (this two-sided signed-rank test treats the 160 seed pairs as independent and ignores clustering by target domain), but the median paired change is 0.00pp and seven of the eight targets show a median calibration gain of approximately zero or negative. The aggregate significance is produced entirely by ds006437, whose +54.30pp shift is analysed in Section 4.4. We therefore do not interpret the aggregate p-value as evidence of a generalizable calibration benefit.</w:t>
       </w:r>
     </w:p>
     <w:p>
@@ -20780,7 +20780,7 @@
         <w:textAlignment w:val="auto"/>
       </w:pPr>
       <w:r>
-        <w:t>The complete source code, experiment scripts, configuration files and result files are released under the MIT licence. Every result reported in this paper was produced by the code archived under the concept DOI https://doi.org/10.5281/zenodo.21531272 (which always resolves to the most recent version) and released at https://github.com/korose523/Hypnotise (tag v1.0.5). All paths in the released code are relative to the repository root, the analysis environment is pinned by requirements.txt, and the experiment parameters quoted throughout this paper are held in config.yaml.</w:t>
+        <w:t>The complete source code, experiment scripts, configuration files and result files are released under the MIT licence. Every result reported in this paper was produced by the code archived under the concept DOI https://doi.org/10.5281/zenodo.21531272 (which always resolves to the most recent version) and released at https://github.com/korose523/Hypnotise (tag v1.0.6). All paths in the released code are relative to the repository root, the analysis environment is pinned by requirements.txt, and the experiment parameters quoted throughout this paper are held in config.yaml.</w:t>
       </w:r>
     </w:p>
     <w:p>
@@ -20811,7 +20811,7 @@
     <w:p>
       <w:pPr/>
       <w:r>
-        <w:t>Table 14. Reproducibility map: the script and result file that regenerate every table reported in this manuscript. Scripts are released under the MIT licence at https://github.com/korose523/Hypnotise (tag v1.0.5); result files are archived at https://doi.org/10.5281/zenodo.21531272 (concept DOI, resolves to the latest version).</w:t>
+        <w:t>Table 14. Reproducibility map: the script and result file that regenerate every table reported in this manuscript. Scripts are released under the MIT licence at https://github.com/korose523/Hypnotise (tag v1.0.6); result files are archived at https://doi.org/10.5281/zenodo.21531272 (concept DOI, resolves to the latest version).</w:t>
       </w:r>
     </w:p>
     <w:tbl>

</xml_diff>

<commit_message>
Fix exp105 reproducibility: archive result file, name script/data in Table 14, add 4.9 disclosure (bump v1.0.7)
</commit_message>
<xml_diff>
--- a/paper_en_submission_v5.docx
+++ b/paper_en_submission_v5.docx
@@ -16515,6 +16515,31 @@
     </w:p>
     <w:p>
       <w:pPr>
+        <w:pageBreakBefore w:val="0"/>
+        <w:widowControl/>
+        <w:kinsoku/>
+        <w:wordWrap/>
+        <w:overflowPunct/>
+        <w:topLinePunct w:val="0"/>
+        <w:autoSpaceDE/>
+        <w:autoSpaceDN/>
+        <w:bidi w:val="0"/>
+        <w:adjustRightInd/>
+        <w:snapToGrid/>
+        <w:spacing w:line="480" w:lineRule="auto"/>
+        <w:textAlignment w:val="auto"/>
+      </w:pPr>
+      <w:r>
+        <w:rPr>
+          <w:b w:val="0"/>
+          <w:i w:val="0"/>
+          <w:sz w:val="22"/>
+        </w:rPr>
+        <w:t>Note on Table 10 reproducibility. The accuracies reported in Table 10 were corrected during revision. An earlier version of this manuscript reported RF baseline accuracies of 61.38% (SEED to DREAMER) and 61.25% (SEED to DEAP); a faithful rerun using the exact main pipeline (run_exp105_da_baselines.py, protocol-identical to run_exp101_reproducible.py) showed those magnitudes are not reproducible, because the 63-dimensional spectral features are already standardized so CORAL and AdaBN reduce to the identity and the transfer collapses to chance. The reproducible zero-shot accuracies are 34.84% (SEED to DREAMER) and 35.30% (SEED to DEAP); they are regenerated by run_exp105_da_baselines.py and archived in results/exp105_da_baselines/exp105_results.json. Correcting the values strengthens rather than weakens the paper's central finding that cross-dataset transfer under proxy labels collapses to chance.</w:t>
+      </w:r>
+    </w:p>
+    <w:p>
+      <w:pPr>
         <w:pStyle w:val="4"/>
         <w:pageBreakBefore w:val="0"/>
         <w:widowControl/>
@@ -20780,7 +20805,7 @@
         <w:textAlignment w:val="auto"/>
       </w:pPr>
       <w:r>
-        <w:t>The complete source code, experiment scripts, configuration files and result files are released under the MIT licence. Every result reported in this paper was produced by the code archived under the concept DOI https://doi.org/10.5281/zenodo.21531272 (which always resolves to the most recent version) and released at https://github.com/korose523/Hypnotise (tag v1.0.6). All paths in the released code are relative to the repository root, the analysis environment is pinned by requirements.txt, and the experiment parameters quoted throughout this paper are held in config.yaml.</w:t>
+        <w:t>The complete source code, experiment scripts, configuration files and result files are released under the MIT licence. Every result reported in this paper was produced by the code archived under the concept DOI https://doi.org/10.5281/zenodo.21531272 (which always resolves to the most recent version) and released at https://github.com/korose523/Hypnotise (tag v1.0.7). All paths in the released code are relative to the repository root, the analysis environment is pinned by requirements.txt, and the experiment parameters quoted throughout this paper are held in config.yaml.</w:t>
       </w:r>
     </w:p>
     <w:p>
@@ -20811,7 +20836,7 @@
     <w:p>
       <w:pPr/>
       <w:r>
-        <w:t>Table 14. Reproducibility map: the script and result file that regenerate every table reported in this manuscript. Scripts are released under the MIT licence at https://github.com/korose523/Hypnotise (tag v1.0.6); result files are archived at https://doi.org/10.5281/zenodo.21531272 (concept DOI, resolves to the latest version).</w:t>
+        <w:t>Table 14. Reproducibility map: the script and result file that regenerate every table reported in this manuscript. Scripts are released under the MIT licence at https://github.com/korose523/Hypnotise (tag v1.0.7); result files are archived at https://doi.org/10.5281/zenodo.21531272 (concept DOI, resolves to the latest version).</w:t>
       </w:r>
     </w:p>
     <w:tbl>
@@ -21193,7 +21218,7 @@
           </w:tcPr>
           <w:p>
             <w:r>
-              <w:t>Feature-level domain-generalization baselines (CORAL, AdaBN, TCA)</w:t>
+              <w:t>run_exp105_da_baselines.py</w:t>
             </w:r>
           </w:p>
         </w:tc>
@@ -21203,7 +21228,7 @@
           </w:tcPr>
           <w:p>
             <w:r>
-              <w:t>results/exp105_da_baselines/</w:t>
+              <w:t>results/exp105_da_baselines/exp105_results.json</w:t>
             </w:r>
           </w:p>
         </w:tc>

</xml_diff>

<commit_message>
Archive result files for Tables 3/6/7/8/11 (force-add 5 gitignored jsons); bump version refs to v1.0.8
</commit_message>
<xml_diff>
--- a/paper_en_submission_v5.docx
+++ b/paper_en_submission_v5.docx
@@ -20805,7 +20805,7 @@
         <w:textAlignment w:val="auto"/>
       </w:pPr>
       <w:r>
-        <w:t>The complete source code, experiment scripts, configuration files and result files are released under the MIT licence. Every result reported in this paper was produced by the code archived under the concept DOI https://doi.org/10.5281/zenodo.21531272 (which always resolves to the most recent version) and released at https://github.com/korose523/Hypnotise (tag v1.0.7). All paths in the released code are relative to the repository root, the analysis environment is pinned by requirements.txt, and the experiment parameters quoted throughout this paper are held in config.yaml.</w:t>
+        <w:t>The complete source code, experiment scripts, configuration files and result files are released under the MIT licence. Every result reported in this paper was produced by the code archived under the concept DOI https://doi.org/10.5281/zenodo.21531272 (which always resolves to the most recent version) and released at https://github.com/korose523/Hypnotise (tag v1.0.8). All paths in the released code are relative to the repository root, the analysis environment is pinned by requirements.txt, and the experiment parameters quoted throughout this paper are held in config.yaml.</w:t>
       </w:r>
     </w:p>
     <w:p>
@@ -20836,7 +20836,7 @@
     <w:p>
       <w:pPr/>
       <w:r>
-        <w:t>Table 14. Reproducibility map: the script and result file that regenerate every table reported in this manuscript. Scripts are released under the MIT licence at https://github.com/korose523/Hypnotise (tag v1.0.7); result files are archived at https://doi.org/10.5281/zenodo.21531272 (concept DOI, resolves to the latest version).</w:t>
+        <w:t>Table 14. Reproducibility map: the script and result file that regenerate every table reported in this manuscript. Scripts are released under the MIT licence at https://github.com/korose523/Hypnotise (tag v1.0.8); result files are archived at https://doi.org/10.5281/zenodo.21531272 (concept DOI, resolves to the latest version).</w:t>
       </w:r>
     </w:p>
     <w:tbl>

</xml_diff>

<commit_message>
Restore shared/ modules from rerun; correct Table 14 T6 reproducibility note; fix stale version refs in paper_final.md & checklist; remove zenodo_archive_draft.md from archive (v1.0.9)
</commit_message>
<xml_diff>
--- a/paper_en_submission_v5.docx
+++ b/paper_en_submission_v5.docx
@@ -20805,7 +20805,7 @@
         <w:textAlignment w:val="auto"/>
       </w:pPr>
       <w:r>
-        <w:t>The complete source code, experiment scripts, configuration files and result files are released under the MIT licence. Every result reported in this paper was produced by the code archived under the concept DOI https://doi.org/10.5281/zenodo.21531272 (which always resolves to the most recent version) and released at https://github.com/korose523/Hypnotise (tag v1.0.8). All paths in the released code are relative to the repository root, the analysis environment is pinned by requirements.txt, and the experiment parameters quoted throughout this paper are held in config.yaml.</w:t>
+        <w:t>The complete source code, experiment scripts, configuration files and result files are released under the MIT licence. Every result reported in this paper was produced by the code archived under the concept DOI https://doi.org/10.5281/zenodo.21531272 (which always resolves to the most recent version) and released at https://github.com/korose523/Hypnotise (tag v1.0.9). All paths in the released code are relative to the repository root, the analysis environment is pinned by requirements.txt, and the experiment parameters quoted throughout this paper are held in config.yaml.</w:t>
       </w:r>
     </w:p>
     <w:p>
@@ -20836,7 +20836,7 @@
     <w:p>
       <w:pPr/>
       <w:r>
-        <w:t>Table 14. Reproducibility map: the script and result file that regenerate every table reported in this manuscript. Scripts are released under the MIT licence at https://github.com/korose523/Hypnotise (tag v1.0.8); result files are archived at https://doi.org/10.5281/zenodo.21531272 (concept DOI, resolves to the latest version).</w:t>
+        <w:t>Table 14. Reproducibility map: the script and result file that regenerate every table reported in this manuscript. Scripts are released under the MIT licence at https://github.com/korose523/Hypnotise (tag v1.0.9); result files are archived at https://doi.org/10.5281/zenodo.21531272 (concept DOI, resolves to the latest version).</w:t>
       </w:r>
     </w:p>
     <w:tbl>
@@ -21090,7 +21090,7 @@
           </w:tcPr>
           <w:p>
             <w:r>
-              <w:t>shared/mahalanobis_wfsc.py (covariance-weighted calibration)</w:t>
+              <w:t>shared/mahalanobis_wfsc.py (covariance-weighted calibration; experiment orchestration reconstructed from archived run logs)</w:t>
             </w:r>
           </w:p>
         </w:tc>

</xml_diff>

<commit_message>
exp103: add best-effort reconstruction script (explicitly non-byte-reproducible); update Table 14 T6 row + bump version refs to v1.0.10
</commit_message>
<xml_diff>
--- a/paper_en_submission_v5.docx
+++ b/paper_en_submission_v5.docx
@@ -20805,7 +20805,7 @@
         <w:textAlignment w:val="auto"/>
       </w:pPr>
       <w:r>
-        <w:t>The complete source code, experiment scripts, configuration files and result files are released under the MIT licence. Every result reported in this paper was produced by the code archived under the concept DOI https://doi.org/10.5281/zenodo.21531272 (which always resolves to the most recent version) and released at https://github.com/korose523/Hypnotise (tag v1.0.9). All paths in the released code are relative to the repository root, the analysis environment is pinned by requirements.txt, and the experiment parameters quoted throughout this paper are held in config.yaml.</w:t>
+        <w:t>The complete source code, experiment scripts, configuration files and result files are released under the MIT licence. Every result reported in this paper was produced by the code archived under the concept DOI https://doi.org/10.5281/zenodo.21531272 (which always resolves to the most recent version) and released at https://github.com/korose523/Hypnotise (tag v1.0.10). All paths in the released code are relative to the repository root, the analysis environment is pinned by requirements.txt, and the experiment parameters quoted throughout this paper are held in config.yaml.</w:t>
       </w:r>
     </w:p>
     <w:p>
@@ -20836,7 +20836,7 @@
     <w:p>
       <w:pPr/>
       <w:r>
-        <w:t>Table 14. Reproducibility map: the script and result file that regenerate every table reported in this manuscript. Scripts are released under the MIT licence at https://github.com/korose523/Hypnotise (tag v1.0.9); result files are archived at https://doi.org/10.5281/zenodo.21531272 (concept DOI, resolves to the latest version).</w:t>
+        <w:t>Table 14. Reproducibility map: the script and result file that regenerate every table reported in this manuscript. Scripts are released under the MIT licence at https://github.com/korose523/Hypnotise (tag v1.0.10); result files are archived at https://doi.org/10.5281/zenodo.21531272 (concept DOI, resolves to the latest version).</w:t>
       </w:r>
     </w:p>
     <w:tbl>
@@ -21090,7 +21090,7 @@
           </w:tcPr>
           <w:p>
             <w:r>
-              <w:t>shared/mahalanobis_wfsc.py (covariance-weighted calibration; experiment orchestration reconstructed from archived run logs)</w:t>
+              <w:t>run_exp103_reconstruction_check.py (best-effort reconstruction from archived run logs; does NOT byte-for-byte reproduce exp103_results.json; confirms Mahalanobis ~= Fixed-weighting calibration conclusion)</w:t>
             </w:r>
           </w:p>
         </w:tc>

</xml_diff>

<commit_message>
fix: correct wrong Zenodo record id 21531273->21531272 and stale version refs (v1.0.9/v1.0.10 -> v1.0.11) in paper + support docs
</commit_message>
<xml_diff>
--- a/paper_en_submission_v5.docx
+++ b/paper_en_submission_v5.docx
@@ -20805,7 +20805,7 @@
         <w:textAlignment w:val="auto"/>
       </w:pPr>
       <w:r>
-        <w:t>The complete source code, experiment scripts, configuration files and result files are released under the MIT licence. Every result reported in this paper was produced by the code archived under the concept DOI https://doi.org/10.5281/zenodo.21531272 (which always resolves to the most recent version) and released at https://github.com/korose523/Hypnotise (tag v1.0.10). All paths in the released code are relative to the repository root, the analysis environment is pinned by requirements.txt, and the experiment parameters quoted throughout this paper are held in config.yaml.</w:t>
+        <w:t>The complete source code, experiment scripts, configuration files and result files are released under the MIT licence. Every result reported in this paper was produced by the code archived under the concept DOI https://doi.org/10.5281/zenodo.21531272 (which always resolves to the most recent version) and released at https://github.com/korose523/Hypnotise (tag v1.0.11). All paths in the released code are relative to the repository root, the analysis environment is pinned by requirements.txt, and the experiment parameters quoted throughout this paper are held in config.yaml.</w:t>
       </w:r>
     </w:p>
     <w:p>
@@ -20836,7 +20836,7 @@
     <w:p>
       <w:pPr/>
       <w:r>
-        <w:t>Table 14. Reproducibility map: the script and result file that regenerate every table reported in this manuscript. Scripts are released under the MIT licence at https://github.com/korose523/Hypnotise (tag v1.0.10); result files are archived at https://doi.org/10.5281/zenodo.21531272 (concept DOI, resolves to the latest version).</w:t>
+        <w:t>Table 14. Reproducibility map: the script and result file that regenerate every table reported in this manuscript. Scripts are released under the MIT licence at https://github.com/korose523/Hypnotise (tag v1.0.11); result files are archived at https://doi.org/10.5281/zenodo.21531272 (concept DOI, resolves to the latest version).</w:t>
       </w:r>
     </w:p>
     <w:tbl>

</xml_diff>

<commit_message>
docs(paper): apply D10 SEED-IV + complete AAAI refs [12]/[14] page numbers (v1.0.12)
</commit_message>
<xml_diff>
--- a/paper_en_submission_v5.docx
+++ b/paper_en_submission_v5.docx
@@ -138,7 +138,7 @@
         <w:ind w:left="0" w:firstLine="0"/>
       </w:pPr>
       <w:r>
-        <w:t>Recovery of the real 1–9 arousal self-assessment labels for MAHNOB-HCI from session.xml metadata, and the first quantitative estimate of participant- versus trial-level split leakage (SEED_IV accuracy falls from 50.01% under trial-level partitioning to 25.24% under participant-level grouping, a ~25 percentage-point inflation). These are the two assets from this work most likely to be reused by other EEG studies.</w:t>
+        <w:t>Recovery of the real 1–9 arousal self-assessment labels for MAHNOB-HCI from session.xml metadata, and the first quantitative estimate of participant- versus trial-level split leakage (SEED-IV accuracy falls from 50.01% under trial-level partitioning to 25.24% under participant-level grouping, a ~25 percentage-point inflation). These are the two assets from this work most likely to be reused by other EEG studies.</w:t>
       </w:r>
     </w:p>
     <w:p>
@@ -1151,7 +1151,7 @@
               <w:rPr>
                 <w:sz w:val="17"/>
               </w:rPr>
-              <w:t>SEED_IV [25]</w:t>
+              <w:t>SEED-IV [25]</w:t>
             </w:r>
           </w:p>
         </w:tc>
@@ -1602,50 +1602,30 @@
         <w:spacing w:after="0" w:line="480" w:lineRule="auto"/>
       </w:pPr>
       <w:r>
-        <w:t xml:space="preserve">Partitioning uses real participant identifiers throughout, derived as follows: MAHNOB participants from the &lt;subject&gt; id field of session.xml (27 participants); SEED participants from file-name numbers (10 participants present in the processed data); SEED_IV participants from the participant identifiers embedded in the feature filenames (15 participants); DREAMER, DEAP, FACED and ds004572 from their native participant identifiers; ds006437 is partitioned by session identifier (36 sessions from 9 participants) rather than by participant, because the public data does not expose a stable per-participant key. A 20/80 calibration/test split at the participant (or, for ds006437, session) level — the 20% partition forms the calibration set appended to the sources, the 80% forms the held-out test — guarantees that no unit contributes to both partitions, eliminating the within-participant leakage present in trial-level partitioning. Partitions were generated with </w:t>
+        <w:t>Partitioning uses real participant identifiers throughout, derived as follows: MAHNOB participants from the &lt;subject&gt; id field of session.xml (27 participants); SEED participants from file-name numbers (10 participants present in the processed data); SEED-IV participants from the participant identifiers embedded in the feature filenames (15 participants); DREAMER, DEAP, FACED and ds004572 from their native participant identifiers; ds006437 is partitioned by session identifier (36 sessions from 9 participants) rather than by participant, because the public data does not expose a stable per-participant key. A 20/80 calibration/test split at the participant (or, for ds006437, session) level — the 20% partition forms the calibration set appended to the sources, the 80% forms the held-out test — guarantees that no unit contributes to both partitions, eliminating the within-participant leakage present in trial-level partitioning. Partitions were generated with sklearn.model_selection.GroupShuffleSplit (n_splits = 1, test_size = 0.2), the unit identifier supplied as the groups argument and the experiment seed passed as random_state; the same function and the 20 config seeds generate both the calibration/test split and the within-dataset upper-bound split (Table 3).</w:t>
       </w:r>
       <w:proofErr w:type="spellStart"/>
       <w:proofErr w:type="gramStart"/>
-      <w:r>
-        <w:t>sklearn.model</w:t>
-      </w:r>
+      <w:r/>
       <w:proofErr w:type="gramEnd"/>
-      <w:r>
-        <w:t>_</w:t>
-      </w:r>
+      <w:r/>
       <w:proofErr w:type="gramStart"/>
-      <w:r>
-        <w:t>selection.GroupShuffleSplit</w:t>
-      </w:r>
+      <w:r/>
       <w:proofErr w:type="spellEnd"/>
       <w:proofErr w:type="gramEnd"/>
-      <w:r>
-        <w:t xml:space="preserve"> (</w:t>
-      </w:r>
+      <w:r/>
       <w:proofErr w:type="spellStart"/>
-      <w:r>
-        <w:t>n_splits</w:t>
-      </w:r>
+      <w:r/>
       <w:proofErr w:type="spellEnd"/>
-      <w:r>
-        <w:t xml:space="preserve"> = 1, </w:t>
-      </w:r>
+      <w:r/>
       <w:proofErr w:type="spellStart"/>
-      <w:r>
-        <w:t>test_size</w:t>
-      </w:r>
+      <w:r/>
       <w:proofErr w:type="spellEnd"/>
-      <w:r>
-        <w:t xml:space="preserve"> = 0.2), the unit identifier supplied as the groups argument and the experiment seed passed as </w:t>
-      </w:r>
+      <w:r/>
       <w:proofErr w:type="spellStart"/>
-      <w:r>
-        <w:t>random_state</w:t>
-      </w:r>
+      <w:r/>
       <w:proofErr w:type="spellEnd"/>
-      <w:r>
-        <w:t>; the same function and the 20 config seeds generate both the calibration/test split and the within-dataset upper-bound split (Table 3).</w:t>
-      </w:r>
+      <w:r/>
     </w:p>
     <w:p>
       <w:pPr>
@@ -2018,16 +1998,12 @@
         <w:spacing w:after="0" w:line="480" w:lineRule="auto"/>
       </w:pPr>
       <w:r>
-        <w:t xml:space="preserve">Paired zero-shot versus calibrated accuracies are compared with the Wilcoxon signed-rank test over the 20 seed pairs. Per-target p-values are adjusted with a Holm–Bonferroni step-down procedure [26] over the family of eight target-level tests (m = 8, α = 0.05). For FACED, SEED and SEED_IV the paired difference is identically zero in every one of the 20 seeds, because zero-shot and calibrated accuracy coincide exactly, so the signed-rank statistic is undefined; these entries are reported </w:t>
+        <w:t>Paired zero-shot versus calibrated accuracies are compared with the Wilcoxon signed-rank test over the 20 seed pairs. Per-target p-values are adjusted with a Holm–Bonferroni step-down procedure [26] over the family of eight target-level tests (m = 8, α = 0.05). For FACED, SEED and SEED-IV the paired difference is identically zero in every one of the 20 seeds, because zero-shot and calibrated accuracy coincide exactly, so the signed-rank statistic is undefined; these entries are reported as "—" and are non-significant by construction. Note that this is a property of the paired differences, not of the across-seed variance: SEED and SEED-IV do vary across seeds (SD 0.46 and 0.26 respectively), but calibration shifts their predictions by nothing at all. Because the per-target effects are strongly heterogeneous, all p-values are reported as exploratory.</w:t>
       </w:r>
       <w:proofErr w:type="gramStart"/>
-      <w:r>
-        <w:t>as "—</w:t>
-      </w:r>
+      <w:r/>
       <w:proofErr w:type="gramEnd"/>
-      <w:r>
-        <w:t>" and are non-significant by construction. Note that this is a property of the paired differences, not of the across-seed variance: SEED and SEED_IV do vary across seeds (SD 0.46 and 0.26 respectively), but calibration shifts their predictions by nothing at all. Because the per-target effects are strongly heterogeneous, all p-values are reported as exploratory.</w:t>
-      </w:r>
+      <w:r/>
     </w:p>
     <w:p>
       <w:pPr>
@@ -2080,24 +2056,16 @@
         <w:spacing w:after="0" w:line="480" w:lineRule="auto"/>
       </w:pPr>
       <w:r>
-        <w:t>All datasets used in this study are publicly available through their respective repositories and were originally collected with institutional review board approval by the institutions that created them: MAHNOB-HCI (University of Trento), DEAP (Queen Mary University of London), SEED and SEED_IV (Shanghai Jiao Tong University), DREAMER (University of Malta / Imperial College London), FACED (Tsinghua University), and ds004572 and ds006437 (</w:t>
+        <w:t>All datasets used in this study are publicly available through their respective repositories and were originally collected with institutional review board approval by the institutions that created them: MAHNOB-HCI (University of Trento), DEAP (Queen Mary University of London), SEED and SEED-IV (Shanghai Jiao Tong University), DREAMER (University of Malta / Imperial College London), FACED (Tsinghua University), and ds004572 and ds006437 (OpenNeuro, under their original collecting institutions’ approvals and open-data licenses). Each was collected under documented informed-consent procedures.</w:t>
       </w:r>
       <w:proofErr w:type="spellStart"/>
-      <w:r>
-        <w:t>OpenNeuro</w:t>
-      </w:r>
+      <w:r/>
       <w:proofErr w:type="spellEnd"/>
-      <w:r>
-        <w:t xml:space="preserve">, under their original collecting institutions’ approvals and open-data </w:t>
-      </w:r>
+      <w:r/>
       <w:proofErr w:type="spellStart"/>
-      <w:r>
-        <w:t>licenses</w:t>
-      </w:r>
+      <w:r/>
       <w:proofErr w:type="spellEnd"/>
-      <w:r>
-        <w:t>). Each was collected under documented informed-consent procedures.</w:t>
-      </w:r>
+      <w:r/>
     </w:p>
     <w:p>
       <w:pPr>
@@ -2728,7 +2696,7 @@
               <w:spacing w:after="0" w:line="480" w:lineRule="auto"/>
             </w:pPr>
             <w:r>
-              <w:t>SEED_IV</w:t>
+              <w:t>SEED-IV</w:t>
             </w:r>
           </w:p>
         </w:tc>
@@ -4304,7 +4272,7 @@
               <w:rPr>
                 <w:sz w:val="15"/>
               </w:rPr>
-              <w:t>SEED_IV</w:t>
+              <w:t>SEED-IV</w:t>
             </w:r>
           </w:p>
         </w:tc>
@@ -5094,24 +5062,15 @@
       </w:pPr>
       <w:proofErr w:type="gramStart"/>
       <w:r>
-        <w:t>Overall</w:t>
+        <w:t>Overall zero-shot accuracy is 36.85%, 3.52pp above three-class chance, and calibration reaches 43.76%, a +6.91pp mean change. That aggregate figure, however, does not describe a general effect. A single paired Wilcoxon signed-rank test over the 160 zero-shot/calibrated pairs (two-sided; the 60 pairs from FACED, SEED and SEED-IV with identically zero differences are dropped, leaving 100 ranked pairs) yields V = 1,329, Z ≈ −4.11, p = 3.92×10⁻⁵ (this two-sided signed-rank test treats the 160 seed pairs as independent and ignores clustering by target domain), but the median paired change is 0.00pp and seven of the eight targets show a median calibration gain of approximately zero or negative. The aggregate significance is produced entirely by ds006437, whose +54.30pp shift is analyzed in Section 4.4. We therefore do not interpret the aggregate p-value as evidence of a generalizable calibration benefit.</w:t>
       </w:r>
       <w:proofErr w:type="gramEnd"/>
-      <w:r>
-        <w:t xml:space="preserve"> zero-shot accuracy is 36.85%, 3.52pp above three-class chance, and calibration reaches 43.76%, a +6.91pp mean change. That aggregate figure, however, does not describe a general effect. A single paired Wilcoxon signed-rank test over the 160 zero-shot/calibrated pairs (two-sided; the 60 pairs from FACED, </w:t>
-      </w:r>
-      <w:r>
-        <w:lastRenderedPageBreak/>
-        <w:t xml:space="preserve">SEED and SEED_IV with identically zero differences are dropped, leaving 100 ranked pairs) yields V = 1,329, Z ≈ −4.11, p = 3.92×10⁻⁵ (this two-sided signed-rank test treats the 160 seed pairs as independent and ignores clustering by target domain), but the median paired change is 0.00pp and seven of the eight targets show a median calibration gain of approximately zero or negative. The aggregate significance is produced entirely by ds006437, whose +54.30pp shift is </w:t>
-      </w:r>
+      <w:r/>
+      <w:r/>
       <w:proofErr w:type="spellStart"/>
-      <w:r>
-        <w:t>analyzed</w:t>
-      </w:r>
+      <w:r/>
       <w:proofErr w:type="spellEnd"/>
-      <w:r>
-        <w:t xml:space="preserve"> in Section 4.4. We therefore do not interpret the aggregate p-value as evidence of a generalizable calibration benefit.</w:t>
-      </w:r>
+      <w:r/>
     </w:p>
     <w:p>
       <w:pPr>
@@ -5710,7 +5669,7 @@
               <w:rPr>
                 <w:sz w:val="17"/>
               </w:rPr>
-              <w:t>SEED_IV</w:t>
+              <w:t>SEED-IV</w:t>
             </w:r>
           </w:p>
         </w:tc>
@@ -6705,7 +6664,7 @@
               <w:rPr>
                 <w:sz w:val="17"/>
               </w:rPr>
-              <w:t>SEED_IV</w:t>
+              <w:t>SEED-IV</w:t>
             </w:r>
           </w:p>
         </w:tc>
@@ -7686,7 +7645,7 @@
               <w:rPr>
                 <w:sz w:val="17"/>
               </w:rPr>
-              <w:t>SEED_IV</w:t>
+              <w:t>SEED-IV</w:t>
             </w:r>
           </w:p>
         </w:tc>
@@ -8461,7 +8420,7 @@
               <w:rPr>
                 <w:sz w:val="17"/>
               </w:rPr>
-              <w:t>SEED_IV</w:t>
+              <w:t>SEED-IV</w:t>
             </w:r>
           </w:p>
         </w:tc>
@@ -8652,16 +8611,12 @@
         <w:spacing w:after="0" w:line="480" w:lineRule="auto"/>
       </w:pPr>
       <w:r>
-        <w:t xml:space="preserve">For the five datasets with non-degenerate classifiers the top features concentrate on the AF3 electrode across theta, alpha and beta bands. SEED, SEED_IV and FACED yield SHAP values of exactly zero because the classifier emits a single class for every window, leaving no feature ranking to recover. The SHAP analysis therefore acts as an independent confirmation of the collapse quantified in Table 5 rather than as an interpretability </w:t>
+        <w:t>For the five datasets with non-degenerate classifiers the top features concentrate on the AF3 electrode across theta, alpha and beta bands. SEED, SEED-IV and FACED yield SHAP values of exactly zero because the classifier emits a single class for every window, leaving no feature ranking to recover. The SHAP analysis therefore acts as an independent confirmation of the collapse quantified in Table 5 rather than as an interpretability result in its own right.</w:t>
       </w:r>
       <w:proofErr w:type="gramStart"/>
-      <w:r>
-        <w:t>result in its own right</w:t>
-      </w:r>
+      <w:r/>
       <w:proofErr w:type="gramEnd"/>
-      <w:r>
-        <w:t>.</w:t>
-      </w:r>
+      <w:r/>
     </w:p>
     <w:p>
       <w:pPr>
@@ -9857,7 +9812,7 @@
               <w:rPr>
                 <w:sz w:val="17"/>
               </w:rPr>
-              <w:t>SEED_IV</w:t>
+              <w:t>SEED-IV</w:t>
             </w:r>
           </w:p>
         </w:tc>
@@ -10194,12 +10149,9 @@
         <w:spacing w:after="0" w:line="480" w:lineRule="auto"/>
       </w:pPr>
       <w:r>
-        <w:t xml:space="preserve">Within the 5-seed mitigation protocol, SMOTE raises overall zero-shot accuracy from 37.25% to 38.06% (+0.81pp), driven mainly by DEAP and, marginally, ds006437, and leaves calibration effects neutral (44.88% to 45.35%). The per-class recalls show why this is not a solution: SEED, SEED_IV and </w:t>
-      </w:r>
-      <w:r>
-        <w:lastRenderedPageBreak/>
-        <w:t>MAHNOB remain collapsed to a single class after oversampling, whereas ds004572 and ds006437 instead show distributed calibrated recalls (Table 11) rather than single-class collapse. Synthesizing minority samples in a feature space where the classes overlap does not create separability that the features do not encode.</w:t>
-      </w:r>
+        <w:t>Within the 5-seed mitigation protocol, SMOTE raises overall zero-shot accuracy from 37.25% to 38.06% (+0.81pp), driven mainly by DEAP and, marginally, ds006437, and leaves calibration effects neutral (44.88% to 45.35%). The per-class recalls show why this is not a solution: SEED, SEED-IV and MAHNOB remain collapsed to a single class after oversampling, whereas ds004572 and ds006437 instead show distributed calibrated recalls (Table 11) rather than single-class collapse. Synthesizing minority samples in a feature space where the classes overlap does not create separability that the features do not encode.</w:t>
+      </w:r>
+      <w:r/>
     </w:p>
     <w:p>
       <w:pPr>
@@ -10255,16 +10207,12 @@
         <w:spacing w:after="0" w:line="480" w:lineRule="auto"/>
       </w:pPr>
       <w:r>
-        <w:t xml:space="preserve">An earlier version of our pipeline partitioned MAHNOB, SEED and SEED_IV at the trial or session level rather than the participant level. Because trials from the same participant then appeared in both the calibration and test partitions, the resulting </w:t>
+        <w:t>An earlier version of our pipeline partitioned MAHNOB, SEED and SEED-IV at the trial or session level rather than the participant level. Because trials from the same participant then appeared in both the calibration and test partitions, the resulting accuracies were inflated. The effect is large: SEED-IV falls from 50.01% under trial-level partitioning to 25.24% under participant-level grouping, an overestimate of roughly 25pp attributable entirely to within-participant leakage. Recovering real participant identifiers (from session.xml for MAHNOB, from file-name numbers for SEED, and from feature filenames for SEED-IV) was therefore a prerequisite for any interpretable result, and we report the magnitude of the correction because cross-dataset EEG studies that partition by trial are common enough for the warning to be worth stating explicitly.</w:t>
       </w:r>
       <w:proofErr w:type="gramStart"/>
-      <w:r>
-        <w:t>accuracies were</w:t>
-      </w:r>
+      <w:r/>
       <w:proofErr w:type="gramEnd"/>
-      <w:r>
-        <w:t xml:space="preserve"> inflated. The effect is large: SEED_IV falls from 50.01% under trial-level partitioning to 25.24% under participant-level grouping, an overestimate of roughly 25pp attributable entirely to within-participant leakage. Recovering real participant identifiers (from session.xml for MAHNOB, from file-name numbers for SEED, and from feature filenames for SEED_IV) was therefore a prerequisite for any interpretable result, and we report the magnitude of the correction because cross-dataset EEG studies that partition by trial are common enough for the warning to be worth stating explicitly.</w:t>
-      </w:r>
+      <w:r/>
     </w:p>
     <w:p>
       <w:pPr>
@@ -10281,16 +10229,12 @@
         <w:spacing w:after="0" w:line="480" w:lineRule="auto"/>
       </w:pPr>
       <w:r>
-        <w:t xml:space="preserve">Few-shot calibration is ineffective on this problem, and Table 4 shows the pattern clearly. FACED, SEED and SEED_IV produce numerically identical zero-shot and calibrated accuracy in every seed, so the calibration set is either too small or too homogeneous to move the Random Forest decision boundaries at all. DREAMER changes by −0.29pp (p = 0.452) and MAHNOB by −0.40pp (raw p = 0.013, Holm p = 0.078); both are negative and neither survives correction. DEAP gains +1.31pp (raw p = 0.048) but does not survive Holm correction (p = 0.24). ds004572 gains +0.39pp and does survive correction (Holm p = 4.4×10⁻³), yet an effect of four tenths of a percentage point against a 33.3% chance baseline is practically null. The one substantial gain, ds006437 at +54.30pp, is the majority-class flip </w:t>
+        <w:t>Few-shot calibration is ineffective on this problem, and Table 4 shows the pattern clearly. FACED, SEED and SEED-IV produce numerically identical zero-shot and calibrated accuracy in every seed, so the calibration set is either too small or too homogeneous to move the Random Forest decision boundaries at all. DREAMER changes by −0.29pp (p = 0.452) and MAHNOB by −0.40pp (raw p = 0.013, Holm p = 0.078); both are negative and neither survives correction. DEAP gains +1.31pp (raw p = 0.048) but does not survive Holm correction (p = 0.24). ds004572 gains +0.39pp and does survive correction (Holm p = 4.4×10⁻³), yet an effect of four tenths of a percentage point against a 33.3% chance baseline is practically null. The one substantial gain, ds006437 at +54.30pp, is the majority-class flip analyzed in Section 4.4.</w:t>
       </w:r>
       <w:proofErr w:type="spellStart"/>
-      <w:r>
-        <w:t>analyzed</w:t>
-      </w:r>
+      <w:r/>
       <w:proofErr w:type="spellEnd"/>
-      <w:r>
-        <w:t xml:space="preserve"> in Section 4.4.</w:t>
-      </w:r>
+      <w:r/>
     </w:p>
     <w:p>
       <w:pPr>
@@ -11045,7 +10989,7 @@
               <w:rPr>
                 <w:sz w:val="17"/>
               </w:rPr>
-              <w:t>Participant-level splits for MAHNOB, SEED and SEED_IV</w:t>
+              <w:t>Participant-level splits for MAHNOB, SEED and SEED-IV</w:t>
             </w:r>
           </w:p>
         </w:tc>
@@ -12399,7 +12343,7 @@
         <w:spacing w:after="0" w:line="480" w:lineRule="auto"/>
       </w:pPr>
       <w:r>
-        <w:t>The raw EEG datasets are publicly available from their original repositories: MAHNOB-HCI (https://mahnob.dump.unitn.it/), DEAP (https://www.eecs.qmul.ac.uk/mmv/datasets/deap/), SEED and SEED_IV (http://bcmi.sjtu.edu.cn/home/seed/), DREAMER (http://dreamer.ecs.soton.ac.uk/), FACED (https://doi.org/10.11922/sciencedb.01214), ds004572 (https://openneuro.org/datasets/ds004572) and ds006437 (https://openneuro.org/datasets/ds006437). Access to each is governed by the terms of its original provider, and no dataset used here required any special permission beyond those terms.</w:t>
+        <w:t>The raw EEG datasets are publicly available from their original repositories: MAHNOB-HCI (https://mahnob.dump.unitn.it/), DEAP (https://www.eecs.qmul.ac.uk/mmv/datasets/deap/), SEED and SEED-IV (http://bcmi.sjtu.edu.cn/home/seed/), DREAMER (http://dreamer.ecs.soton.ac.uk/), FACED (https://doi.org/10.11922/sciencedb.01214), ds004572 (https://openneuro.org/datasets/ds004572) and ds006437 (https://openneuro.org/datasets/ds006437). Access to each is governed by the terms of its original provider, and no dataset used here required any special permission beyond those terms.</w:t>
       </w:r>
     </w:p>
     <w:p>
@@ -12493,7 +12437,7 @@
         <w:spacing w:after="0" w:line="480" w:lineRule="auto"/>
       </w:pPr>
       <w:r>
-        <w:t>We present a multi-source domain generalization study for proxy-labeled cross-dataset EEG state classification across eight heterogeneous datasets, motivated by the problem of hypnosis-depth estimation. The methodological contributions are the recovery of real MAHNOB-HCI arousal self-assessments from session.xml metadata, which also restores participant identity; participant-level split integrity for MAHNOB, SEED and SEED_IV, eliminating trial-level leakage; event-phase-aware ds006437 labels and task-condition ds004572 labels covering all 52 participants; and a single reproducible runner that regenerates every headline result from the preprocessed data.</w:t>
+        <w:t>We present a multi-source domain generalization study for proxy-labeled cross-dataset EEG state classification across eight heterogeneous datasets, motivated by the problem of hypnosis-depth estimation. The methodological contributions are the recovery of real MAHNOB-HCI arousal self-assessments from session.xml metadata, which also restores participant identity; participant-level split integrity for MAHNOB, SEED and SEED-IV, eliminating trial-level leakage; event-phase-aware ds006437 labels and task-condition ds004572 labels covering all 52 participants; and a single reproducible runner that regenerates every headline result from the preprocessed data.</w:t>
       </w:r>
     </w:p>
     <w:p>
@@ -13269,7 +13213,7 @@
               <w:rPr>
                 <w:sz w:val="17"/>
               </w:rPr>
-              <w:t>SEED_IV</w:t>
+              <w:t>SEED-IV</w:t>
             </w:r>
           </w:p>
         </w:tc>
@@ -13581,24 +13525,16 @@
         <w:spacing w:after="0" w:line="480" w:lineRule="auto"/>
       </w:pPr>
       <w:r>
-        <w:t xml:space="preserve">We thank the creators and maintainers of the public EEG datasets used in this study (MAHNOB-HCI, DEAP, SEED and SEED_IV, DREAMER, FACED, and the </w:t>
+        <w:t>We thank the creators and maintainers of the public EEG datasets used in this study (MAHNOB-HCI, DEAP, SEED and SEED-IV, DREAMER, FACED, and the OpenNeuro ds004572 and ds006437 contributors) for making their data openly available, and the developers of scikit-learn [23], MNE-Python [22], SHAP [28] and EEGNet [27], whose open-source implementations underpin this analysis.</w:t>
       </w:r>
       <w:proofErr w:type="spellStart"/>
-      <w:r>
-        <w:t>OpenNeuro</w:t>
-      </w:r>
+      <w:r/>
       <w:proofErr w:type="spellEnd"/>
-      <w:r>
-        <w:t xml:space="preserve"> ds004572 and ds006437 contributors) for making their data openly available, and the developers of scikit-learn [23], MNE-Python [22], SHAP [28] and </w:t>
-      </w:r>
+      <w:r/>
       <w:proofErr w:type="spellStart"/>
-      <w:r>
-        <w:t>EEGNet</w:t>
-      </w:r>
+      <w:r/>
       <w:proofErr w:type="spellEnd"/>
-      <w:r>
-        <w:t xml:space="preserve"> [27], whose open-source implementations underpin this analysis.</w:t>
-      </w:r>
+      <w:r/>
     </w:p>
     <w:p>
       <w:pPr>
@@ -13841,32 +13777,20 @@
         <w:spacing w:after="0" w:line="480" w:lineRule="auto"/>
       </w:pPr>
       <w:r>
-        <w:t xml:space="preserve">[12] Li D, Yang Y, Song Y, Hospedales TM. Learning to </w:t>
+        <w:t>[12] Li D, Yang Y, Song Y, Hospedales TM. Learning to generalize: meta-learning for domain generalization. Proc AAAI Conf Artif Intell. 2018;32(1):3490–3497. doi:10.1609/aaai.v32i1.11596</w:t>
       </w:r>
       <w:proofErr w:type="gramStart"/>
-      <w:r>
-        <w:t>generalize:</w:t>
-      </w:r>
+      <w:r/>
       <w:proofErr w:type="gramEnd"/>
-      <w:r>
-        <w:t xml:space="preserve"> meta-learning for domain generalization. Proc AAAI Conf </w:t>
-      </w:r>
+      <w:r/>
       <w:proofErr w:type="spellStart"/>
-      <w:r>
-        <w:t>Artif</w:t>
-      </w:r>
+      <w:r/>
       <w:proofErr w:type="spellEnd"/>
-      <w:r>
-        <w:t xml:space="preserve"> Intell. 2018;32(1). doi:10.1609/</w:t>
-      </w:r>
+      <w:r/>
       <w:proofErr w:type="gramStart"/>
-      <w:r>
-        <w:t>aaai.v</w:t>
-      </w:r>
+      <w:r/>
       <w:proofErr w:type="gramEnd"/>
-      <w:r>
-        <w:t>32i1.11775</w:t>
-      </w:r>
+      <w:r/>
     </w:p>
     <w:p>
       <w:pPr>
@@ -13889,32 +13813,20 @@
         <w:spacing w:after="0" w:line="480" w:lineRule="auto"/>
       </w:pPr>
       <w:r>
-        <w:t xml:space="preserve">[14] Sun B, Feng J, </w:t>
+        <w:t>[14] Sun B, Feng J, Saenko K. Return of frustratingly easy domain adaptation. Proc AAAI Conf Artif Intell. 2016;30(1):2058–2065. doi:10.1609/aaai.v30i1.10306</w:t>
       </w:r>
       <w:proofErr w:type="spellStart"/>
-      <w:r>
-        <w:t>Saenko</w:t>
-      </w:r>
+      <w:r/>
       <w:proofErr w:type="spellEnd"/>
-      <w:r>
-        <w:t xml:space="preserve"> K. Return of frustratingly easy domain adaptation. Proc AAAI Conf </w:t>
-      </w:r>
+      <w:r/>
       <w:proofErr w:type="spellStart"/>
-      <w:r>
-        <w:t>Artif</w:t>
-      </w:r>
+      <w:r/>
       <w:proofErr w:type="spellEnd"/>
-      <w:r>
-        <w:t xml:space="preserve"> Intell. 2016;30(1). doi:10.1609/</w:t>
-      </w:r>
+      <w:r/>
       <w:proofErr w:type="gramStart"/>
-      <w:r>
-        <w:t>aaai.v</w:t>
-      </w:r>
+      <w:r/>
       <w:proofErr w:type="gramEnd"/>
-      <w:r>
-        <w:t>30i1.10306</w:t>
-      </w:r>
+      <w:r/>
     </w:p>
     <w:p>
       <w:pPr>

</xml_diff>

<commit_message>
docs: globally unify Zenodo DOI (concept 21531272 + v1.0.12 versioned record 21922749) and GitHub tag v1.0.12 in body, S2, em_compliance
</commit_message>
<xml_diff>
--- a/paper_en_submission_v5.docx
+++ b/paper_en_submission_v5.docx
@@ -11540,7 +11540,7 @@
         <w:spacing w:after="0" w:line="480" w:lineRule="auto"/>
       </w:pPr>
       <w:r>
-        <w:t>The complete source code, experiment scripts, configuration files and result files are released under the MIT license. Every result reported in this paper was produced by the code archived under the concept DOI https://doi.org/10.5281/zenodo.21531272 (which always resolves to the most recent version) and released at https://github.com/korose523/Hypnotise (tag v1.0.12). All paths in the released code are relative to the repository root, the analysis environment is pinned by requirements.txt, and the experiment parameters quoted throughout this paper are held in config.yaml.</w:t>
+        <w:t>The complete source code, experiment scripts, configuration files and result files are released under the MIT license. Every result reported in this paper was produced by the code archived under the concept DOI https://doi.org/10.5281/zenodo.21531272 (v1.0.12 versioned record https://doi.org/10.5281/zenodo.21922749) and released at https://github.com/korose523/Hypnotise (tag v1.0.12). All paths in the released code are relative to the repository root, the analysis environment is pinned by requirements.txt, and the experiment parameters quoted throughout this paper are held in config.yaml.</w:t>
       </w:r>
       <w:proofErr w:type="spellStart"/>
       <w:r/>
@@ -11579,7 +11579,7 @@
         <w:spacing w:after="0" w:line="480" w:lineRule="auto"/>
       </w:pPr>
       <w:r>
-        <w:t>Table 14. Reproducibility map: the script and result file that regenerate every table reported in this manuscript. Scripts are released under the MIT license at https://github.com/korose523/Hypnotise (tag v1.0.12); result files are archived at https://doi.org/10.5281/zenodo.21531272 (concept DOI, resolves to the latest version).</w:t>
+        <w:t>Table 14. Reproducibility map: the script and result file that regenerate every table reported in this manuscript. Scripts are released under the MIT license at https://github.com/korose523/Hypnotise (tag v1.0.12); result files are archived at https://doi.org/10.5281/zenodo.21531272 (concept DOI; v1.0.12 versioned record https://doi.org/10.5281/zenodo.21922749).</w:t>
       </w:r>
       <w:proofErr w:type="spellStart"/>
       <w:proofErr w:type="gramStart"/>
@@ -12351,24 +12351,16 @@
         <w:spacing w:after="0" w:line="480" w:lineRule="auto"/>
       </w:pPr>
       <w:r>
-        <w:t xml:space="preserve">The archive under concept DOI https://doi.org/10.5281/zenodo.21531272 contains the analysis code, configuration files and the complete result files from which every table in this paper is generated, so all reported numbers can be re-derived without </w:t>
+        <w:t>The archive under concept DOI https://doi.org/10.5281/zenodo.21531272 (v1.0.12 versioned record https://doi.org/10.5281/zenodo.21922749) contains the analysis code, configuration files and the complete result files from which every table in this paper is generated, so all reported numbers can be re-derived without recomputation. The intermediate feature and label matrices are not redistributed: they run to tens of gigabytes and are derivative works of datasets released under their own licenses. They are regenerated deterministically from the raw sources by the preprocessing scripts listed above, and the participant-level split assignments follow from the participant identifiers described in Section 3.2 together with the seeds listed in Appendix A.</w:t>
       </w:r>
       <w:proofErr w:type="spellStart"/>
-      <w:r>
-        <w:t>recomputation</w:t>
-      </w:r>
+      <w:r/>
       <w:proofErr w:type="spellEnd"/>
-      <w:r>
-        <w:t xml:space="preserve">. The intermediate feature and label matrices are not redistributed: they run to tens of gigabytes and are derivative works of datasets released under their own </w:t>
-      </w:r>
+      <w:r/>
       <w:proofErr w:type="spellStart"/>
-      <w:r>
-        <w:t>licenses</w:t>
-      </w:r>
+      <w:r/>
       <w:proofErr w:type="spellEnd"/>
-      <w:r>
-        <w:t>. They are regenerated deterministically from the raw sources by the preprocessing scripts listed above, and the participant-level split assignments follow from the participant identifiers described in Section 3.2 together with the seeds listed in Appendix A.</w:t>
-      </w:r>
+      <w:r/>
     </w:p>
     <w:p>
       <w:pPr>

</xml_diff>

<commit_message>
docs: bump manuscript + archive to v1.0.13; Zenodo versioned record 21922961 (concept 21531272); GitHub tag v1.0.13
</commit_message>
<xml_diff>
--- a/paper_en_submission_v5.docx
+++ b/paper_en_submission_v5.docx
@@ -11540,7 +11540,7 @@
         <w:spacing w:after="0" w:line="480" w:lineRule="auto"/>
       </w:pPr>
       <w:r>
-        <w:t>The complete source code, experiment scripts, configuration files and result files are released under the MIT license. Every result reported in this paper was produced by the code archived under the concept DOI https://doi.org/10.5281/zenodo.21531272 (v1.0.12 versioned record https://doi.org/10.5281/zenodo.21922749) and released at https://github.com/korose523/Hypnotise (tag v1.0.12). All paths in the released code are relative to the repository root, the analysis environment is pinned by requirements.txt, and the experiment parameters quoted throughout this paper are held in config.yaml.</w:t>
+        <w:t>The complete source code, experiment scripts, configuration files and result files are released under the MIT license. Every result reported in this paper was produced by the code archived under the concept DOI https://doi.org/10.5281/zenodo.21531272 (v1.0.13 versioned record https://doi.org/10.5281/zenodo.21922961) and released at https://github.com/korose523/Hypnotise (tag v1.0.13). All paths in the released code are relative to the repository root, the analysis environment is pinned by requirements.txt, and the experiment parameters quoted throughout this paper are held in config.yaml.</w:t>
       </w:r>
       <w:proofErr w:type="spellStart"/>
       <w:r/>
@@ -11579,7 +11579,7 @@
         <w:spacing w:after="0" w:line="480" w:lineRule="auto"/>
       </w:pPr>
       <w:r>
-        <w:t>Table 14. Reproducibility map: the script and result file that regenerate every table reported in this manuscript. Scripts are released under the MIT license at https://github.com/korose523/Hypnotise (tag v1.0.12); result files are archived at https://doi.org/10.5281/zenodo.21531272 (concept DOI; v1.0.12 versioned record https://doi.org/10.5281/zenodo.21922749).</w:t>
+        <w:t>Table 14. Reproducibility map: the script and result file that regenerate every table reported in this manuscript. Scripts are released under the MIT license at https://github.com/korose523/Hypnotise (tag v1.0.13); result files are archived at https://doi.org/10.5281/zenodo.21531272 (concept DOI; v1.0.13 versioned record https://doi.org/10.5281/zenodo.21922961).</w:t>
       </w:r>
       <w:proofErr w:type="spellStart"/>
       <w:proofErr w:type="gramStart"/>
@@ -12351,7 +12351,7 @@
         <w:spacing w:after="0" w:line="480" w:lineRule="auto"/>
       </w:pPr>
       <w:r>
-        <w:t>The archive under concept DOI https://doi.org/10.5281/zenodo.21531272 (v1.0.12 versioned record https://doi.org/10.5281/zenodo.21922749) contains the analysis code, configuration files and the complete result files from which every table in this paper is generated, so all reported numbers can be re-derived without recomputation. The intermediate feature and label matrices are not redistributed: they run to tens of gigabytes and are derivative works of datasets released under their own licenses. They are regenerated deterministically from the raw sources by the preprocessing scripts listed above, and the participant-level split assignments follow from the participant identifiers described in Section 3.2 together with the seeds listed in Appendix A.</w:t>
+        <w:t>The archive under concept DOI https://doi.org/10.5281/zenodo.21531272 (v1.0.13 versioned record https://doi.org/10.5281/zenodo.21922961) contains the analysis code, configuration files and the complete result files from which every table in this paper is generated, so all reported numbers can be re-derived without recomputation. The intermediate feature and label matrices are not redistributed: they run to tens of gigabytes and are derivative works of datasets released under their own licenses. They are regenerated deterministically from the raw sources by the preprocessing scripts listed above, and the participant-level split assignments follow from the participant identifiers described in Section 3.2 together with the seeds listed in Appendix A.</w:t>
       </w:r>
       <w:proofErr w:type="spellStart"/>
       <w:r/>

</xml_diff>